<commit_message>
logit + RF inicial
</commit_message>
<xml_diff>
--- a/Documents/Bibliografia.docx
+++ b/Documents/Bibliografia.docx
@@ -9,6 +9,16 @@
             <w:rStyle w:val="Hipervnculo"/>
           </w:rPr>
           <w:t>https://www.redalyc.org/pdf/4595/459545415005.pdf</w:t>
+        </w:r>
+      </w:hyperlink>
+    </w:p>
+    <w:p>
+      <w:hyperlink r:id="rId6" w:history="1">
+        <w:r>
+          <w:rPr>
+            <w:rStyle w:val="Hipervnculo"/>
+          </w:rPr>
+          <w:t>https://scielo.isciii.es/scielo.php?script=sci_arttext&amp;pid=S0212-97282014000300040</w:t>
         </w:r>
       </w:hyperlink>
     </w:p>

</xml_diff>

<commit_message>
logit def + rf millorat
</commit_message>
<xml_diff>
--- a/Documents/Bibliografia.docx
+++ b/Documents/Bibliografia.docx
@@ -22,6 +22,17 @@
         </w:r>
       </w:hyperlink>
     </w:p>
+    <w:p>
+      <w:hyperlink r:id="rId7" w:history="1">
+        <w:r>
+          <w:rPr>
+            <w:rStyle w:val="Hipervnculo"/>
+          </w:rPr>
+          <w:t>https://fjmenendez.blogspot.com/2017/03/otra-forma-de-chequear-linealidad-entre.html</w:t>
+        </w:r>
+      </w:hyperlink>
+    </w:p>
+    <w:p/>
     <w:p/>
     <w:sectPr>
       <w:pgSz w:w="11906" w:h="16838"/>

</xml_diff>